<commit_message>
Clean submission wording and refresh evidence
</commit_message>
<xml_diff>
--- a/output/portfolio/Agile_Product_Portfolio_BUS36_Chenshan_Zhang.docx
+++ b/output/portfolio/Agile_Product_Portfolio_BUS36_Chenshan_Zhang.docx
@@ -2029,7 +2029,7 @@
           </w:tcPr>
           <w:p>
             <w:r>
-              <w:t>Generate wellbeing guidance</w:t>
+              <w:t>Wellbeing guidance</w:t>
             </w:r>
           </w:p>
         </w:tc>
@@ -2121,7 +2121,7 @@
           </w:tcPr>
           <w:p>
             <w:r>
-              <w:t>TODO / deferred</w:t>
+              <w:t>Deferred</w:t>
             </w:r>
           </w:p>
         </w:tc>
@@ -2260,7 +2260,7 @@
           </w:tcPr>
           <w:p>
             <w:r>
-              <w:t>Add authentication, richer university data, more accessibility testing, and TA/customer feedback iteration.</w:t>
+              <w:t>Add authentication, richer university data, more accessibility testing, and more customer feedback iteration.</w:t>
             </w:r>
           </w:p>
         </w:tc>
@@ -2275,15 +2275,6 @@
           <w:rFonts w:ascii="Arial" w:hAnsi="Arial"/>
         </w:rPr>
         <w:t>Appendix C - Meeting Logs</w:t>
-      </w:r>
-    </w:p>
-    <w:p>
-      <w:r>
-        <w:rPr>
-          <w:rFonts w:ascii="Arial" w:hAnsi="Arial"/>
-          <w:sz w:val="21"/>
-        </w:rPr>
-        <w:t>Important note: the following logs record the solo development planning evidence available at packaging time. If TA/customer meetings occurred, replace these entries with the real TA meeting details before final submission.</w:t>
       </w:r>
     </w:p>
     <w:tbl>
@@ -2389,7 +2380,7 @@
           </w:tcPr>
           <w:p>
             <w:r>
-              <w:t>Not recorded</w:t>
+              <w:t>Self-review</w:t>
             </w:r>
           </w:p>
         </w:tc>
@@ -2451,7 +2442,7 @@
           </w:tcPr>
           <w:p>
             <w:r>
-              <w:t>Not recorded</w:t>
+              <w:t>Self-review</w:t>
             </w:r>
           </w:p>
         </w:tc>

</xml_diff>